<commit_message>
feat: merge main + add local changes (migrations, scripts, routes, services updates)
</commit_message>
<xml_diff>
--- a/CHECKLISTS/ANTI-FOULING SYSTEM CERTIFICATE/CHECK LIST/AFS-01.docx
+++ b/CHECKLISTS/ANTI-FOULING SYSTEM CERTIFICATE/CHECK LIST/AFS-01.docx
@@ -10587,66 +10587,27 @@
     </w:p>
     <w:p>
       <w:pPr>
-        <w:pStyle w:val="Normal"/>
-        <w:spacing w:lineRule="exact" w:line="201"/>
-        <w:jc w:val="end"/>
-        <w:rPr>
-          <w:rFonts w:ascii="Calibri" w:hAnsi="Calibri" w:eastAsia="Calibri" w:cs="Calibri"/>
+        <w:jc w:val="right"/>
+        <w:spacing w:after="200"/>
+      </w:pPr>
+      <w:sdt>
+        <w:sdtPr>
+          <w:tag w:val="surveyor_name"/>
+        </w:sdtPr>
+        <w:sdtContent>
+          <w:r>
+            <w:t>{surveyor_name}</w:t>
+          </w:r>
+        </w:sdtContent>
+      </w:sdt>
+      <w:r>
+        <w:rPr>
+          <w:rFonts w:ascii="Arial" w:hAnsi="Arial"/>
+          <w:bold/>
           <w:sz w:val="18"/>
-          <w:szCs w:val="18"/>
-        </w:rPr>
-      </w:pPr>
-      <w:r>
-        <w:rPr>
-          <w:rFonts w:ascii="Calibri" w:hAnsi="Calibri"/>
-          <w:b/>
-          <w:sz w:val="18"/>
-        </w:rPr>
-        <w:t xml:space="preserve">                      </w:t>
-      </w:r>
-      <w:r>
-        <w:rPr>
-          <w:rFonts w:ascii="Calibri" w:hAnsi="Calibri"/>
-          <w:b/>
-          <w:sz w:val="18"/>
-        </w:rPr>
-        <w:t>GR</w:t>
-      </w:r>
-      <w:r>
-        <w:rPr>
-          <w:rFonts w:ascii="Calibri" w:hAnsi="Calibri"/>
-          <w:b/>
-          <w:spacing w:val="-7"/>
-          <w:sz w:val="18"/>
-        </w:rPr>
-        <w:t xml:space="preserve"> </w:t>
-      </w:r>
-      <w:r>
-        <w:rPr>
-          <w:rFonts w:ascii="Calibri" w:hAnsi="Calibri"/>
-          <w:b/>
-          <w:spacing w:val="-1"/>
-          <w:sz w:val="18"/>
-        </w:rPr>
-        <w:t>CLASS</w:t>
-      </w:r>
-      <w:r>
-        <w:rPr>
-          <w:rFonts w:ascii="Calibri" w:hAnsi="Calibri"/>
-          <w:b/>
-          <w:spacing w:val="-6"/>
-          <w:sz w:val="18"/>
-        </w:rPr>
-        <w:t xml:space="preserve"> </w:t>
-      </w:r>
-      <w:r>
-        <w:rPr>
-          <w:rFonts w:ascii="Calibri" w:hAnsi="Calibri"/>
-          <w:b/>
-          <w:spacing w:val="-1"/>
-          <w:sz w:val="18"/>
-        </w:rPr>
-        <w:t xml:space="preserve">REPRESENTATIVE </w:t>
+        </w:rPr>
+        <w:br/>
+        <w:t>GR CLASS REPRESENTATIVE</w:t>
       </w:r>
     </w:p>
     <w:p>

</xml_diff>